<commit_message>
docs: update student training reports (final revisions)
</commit_message>
<xml_diff>
--- a/deliverables/第5组_工业安全帽佩戴检测/04.实训总结报告-每人1份/刘睿煊_22009201263_学生实训总结报告.docx
+++ b/deliverables/第5组_工业安全帽佩戴检测/04.实训总结报告-每人1份/刘睿煊_22009201263_学生实训总结报告.docx
@@ -2775,6 +2775,7 @@
         <w:tc>
           <w:tcPr>
             <w:tcW w:w="2160" w:type="dxa"/>
+            <w:vAlign w:val="top"/>
           </w:tcPr>
           <w:p>
             <w:pPr>
@@ -2785,10 +2786,11 @@
             </w:pPr>
             <w:r>
               <w:rPr>
-                <w:rFonts w:hint="default" w:ascii="Times New Roman" w:hAnsi="Times New Roman" w:eastAsia="宋体" w:cs="Times New Roman"/>
+                <w:rFonts w:hint="eastAsia" w:ascii="Times New Roman" w:hAnsi="Times New Roman" w:cs="Times New Roman"/>
                 <w:sz w:val="22"/>
+                <w:lang w:val="en-US" w:eastAsia="zh-CN"/>
               </w:rPr>
-              <w:t>请填写</w:t>
+              <w:t>23009290073</w:t>
             </w:r>
           </w:p>
         </w:tc>
@@ -2873,6 +2875,7 @@
         <w:tc>
           <w:tcPr>
             <w:tcW w:w="2160" w:type="dxa"/>
+            <w:vAlign w:val="top"/>
           </w:tcPr>
           <w:p>
             <w:pPr>
@@ -2886,7 +2889,7 @@
                 <w:rFonts w:hint="default" w:ascii="Times New Roman" w:hAnsi="Times New Roman" w:eastAsia="宋体" w:cs="Times New Roman"/>
                 <w:sz w:val="22"/>
               </w:rPr>
-              <w:t>请填写</w:t>
+              <w:t>23009201178</w:t>
             </w:r>
           </w:p>
         </w:tc>
@@ -2971,6 +2974,7 @@
         <w:tc>
           <w:tcPr>
             <w:tcW w:w="2160" w:type="dxa"/>
+            <w:vAlign w:val="top"/>
           </w:tcPr>
           <w:p>
             <w:pPr>
@@ -2984,7 +2988,7 @@
                 <w:rFonts w:hint="default" w:ascii="Times New Roman" w:hAnsi="Times New Roman" w:eastAsia="宋体" w:cs="Times New Roman"/>
                 <w:sz w:val="22"/>
               </w:rPr>
-              <w:t>请填写</w:t>
+              <w:t>22009201263</w:t>
             </w:r>
           </w:p>
         </w:tc>
@@ -3069,6 +3073,7 @@
         <w:tc>
           <w:tcPr>
             <w:tcW w:w="2160" w:type="dxa"/>
+            <w:vAlign w:val="top"/>
           </w:tcPr>
           <w:p>
             <w:pPr>
@@ -3082,7 +3087,7 @@
                 <w:rFonts w:hint="default" w:ascii="Times New Roman" w:hAnsi="Times New Roman" w:eastAsia="宋体" w:cs="Times New Roman"/>
                 <w:sz w:val="22"/>
               </w:rPr>
-              <w:t>请填写</w:t>
+              <w:t>23009201360</w:t>
             </w:r>
           </w:p>
         </w:tc>
@@ -3167,6 +3172,7 @@
         <w:tc>
           <w:tcPr>
             <w:tcW w:w="2160" w:type="dxa"/>
+            <w:vAlign w:val="top"/>
           </w:tcPr>
           <w:p>
             <w:pPr>
@@ -3180,7 +3186,7 @@
                 <w:rFonts w:hint="default" w:ascii="Times New Roman" w:hAnsi="Times New Roman" w:eastAsia="宋体" w:cs="Times New Roman"/>
                 <w:sz w:val="22"/>
               </w:rPr>
-              <w:t>请填写</w:t>
+              <w:t>23009200551</w:t>
             </w:r>
           </w:p>
         </w:tc>
@@ -3220,6 +3226,8 @@
           <w:sz w:val="32"/>
         </w:rPr>
       </w:pPr>
+      <w:bookmarkStart w:id="0" w:name="_GoBack"/>
+      <w:bookmarkEnd w:id="0"/>
     </w:p>
     <w:p>
       <w:pPr>
@@ -3998,8 +4006,6 @@
         </w:rPr>
         <w:t xml:space="preserve"> </w:t>
       </w:r>
-      <w:bookmarkStart w:id="0" w:name="_GoBack"/>
-      <w:bookmarkEnd w:id="0"/>
       <w:r>
         <w:rPr>
           <w:rFonts w:hint="default" w:ascii="Times New Roman" w:hAnsi="Times New Roman" w:eastAsia="宋体" w:cs="Times New Roman"/>

</xml_diff>